<commit_message>
logs: recover scoped Codex Desktop sessions with provenance
Signed-off-by: Gem Hermit <xizhe.official@gmail.com>
</commit_message>
<xml_diff>
--- a/artifacts/contest/绮迹-参赛作品介绍.docx
+++ b/artifacts/contest/绮迹-参赛作品介绍.docx
@@ -107,7 +107,7 @@
     </w:p>
     <w:p>
       <w:r>
-        <w:t>可复用 Skill 位于 skills/gemini-voice-diagnosis/SKILL.md。当前使用 Codex 辅助开发；本轮官方采集器清单未发现标准会话，真实 AI Coding 日志仍待按官方要求归集。既有其他工具的私有会话备份不随本次预提交上传。本说明不是原始对话日志。</w:t>
+        <w:t>可复用 Skill 位于 skills/gemini-voice-diagnosis/SKILL.md。当前使用 Codex 辅助开发；已从真实原生记录兼容补采 9 个会话、1,766 个事件，通过未修改的官方格式校验。日志明确标记为部分手动补采，排除内部推理与系统指令并对凭据脱敏，是否计入比赛评分仍需组委会确认。既有其他工具的私有会话备份不公开。本说明不是原始对话日志。</w:t>
       </w:r>
     </w:p>
     <w:p>
@@ -125,7 +125,7 @@
     </w:p>
     <w:p>
       <w:r>
-        <w:t>本版以草稿 PR 预提交，尚未正式合入。还需完成：最新固件板端验收、5 分钟以内的真实演示视频、原始 Codex 日志归集，以及公共仓补丁的独立 PR 整理。</w:t>
+        <w:t>本版以草稿 PR 预提交，尚未正式合入。还需完成：最新固件板端验收、5 分钟以内的真实演示视频、Codex 兼容日志的比赛接收确认，以及公共仓补丁的独立 PR 整理。</w:t>
       </w:r>
     </w:p>
     <w:p>

</xml_diff>

<commit_message>
feat: submit dual-device companion, contest materials and recovered logs
</commit_message>
<xml_diff>
--- a/artifacts/contest/绮迹-参赛作品介绍.docx
+++ b/artifacts/contest/绮迹-参赛作品介绍.docx
@@ -7,12 +7,22 @@
         <w:pStyle w:val="Title"/>
       </w:pPr>
       <w:r>
-        <w:t>绮迹：原创角色语音陪伴终端</w:t>
+        <w:t>绮迹：桌面与随身双硬件 AI 伙伴</w:t>
       </w:r>
     </w:p>
     <w:p>
       <w:r>
-        <w:t>队伍：236 无险山妖气迹。方向：AI 硬件产品创新。材料日期：2026-09-19。</w:t>
+        <w:t>队伍：236 无险山妖气迹。选题方向：AI 硬件产品创新。材料更新：2026-09-20。</w:t>
+      </w:r>
+    </w:p>
+    <w:p>
+      <w:r>
+        <w:t>专属仓库：https://github.com/open-vela/contest2026_236_wuxianshanyaoqiji</w:t>
+      </w:r>
+    </w:p>
+    <w:p>
+      <w:r>
+        <w:t>视频：用户已录制，待用户自行上传并补充链接；本材料尚未核验视频文件或时长。</w:t>
       </w:r>
     </w:p>
     <w:p>
@@ -20,17 +30,17 @@
         <w:pStyle w:val="Heading1"/>
       </w:pPr>
       <w:r>
-        <w:t>作品定位</w:t>
+        <w:t>一、作品简介</w:t>
       </w:r>
     </w:p>
     <w:p>
       <w:r>
-        <w:t>绮迹面向学习、工作间隙想进行短时交流的人，以桌面小屏和语音交互提供轻量的原创角色陪伴。用户点一下按钮说话，再点一下结束，角色接收内容、生成回答并朗读。当前产品是开发板原型，尚未完成外壳与量产设计。</w:t>
+        <w:t>绮迹把桌面小屏与随身终端组合成两个具有独立角色设定的 AI 伙伴。用户可以按实体按键发起语音交流，也可以让两个伙伴围绕一个话题轮流交流，最后形成一份交给主人选择的小结。目标是减少小屏打字负担，让短时陪伴从单一问答扩展为可观察的多角色互动。</w:t>
       </w:r>
     </w:p>
     <w:p>
       <w:r>
-        <w:t>角色使用独立绘制的浅紫短发 Q 版形象，具备等待、聆听、思考、回复和异常状态动画。中文人设强调活泼机灵、喜欢被夸、认真努力，以简短口语适配小屏和 TTS。不是特定商业角色的官方产品，也未移植 Live2D。</w:t>
+        <w:t>当前作品是开发板原型：Gemini-S1 是 openvela 主终端，AI Passport 是 ESP-IDF 配套终端，电脑运行局域网协调服务，云端提供识别、文字生成和语音合成。未实现脱离电脑的双机联动、离线大模型、量产外壳或商业化运营。</w:t>
       </w:r>
     </w:p>
     <w:p>
@@ -38,22 +48,27 @@
         <w:pStyle w:val="Heading1"/>
       </w:pPr>
       <w:r>
-        <w:t>技术实现</w:t>
+        <w:t>二、硬件、系统与 openvela 的关系</w:t>
       </w:r>
     </w:p>
     <w:p>
       <w:r>
-        <w:t>Gemini-S1 的 R528 运行 openvela / NuttX。2.8 寸 SPI 屏通过官方 LCD 后端显示，LVGL 渲染界面和角色。按钮触发工作线程，录音、网络和朗读不在 LVGL 事件回调中执行。</w:t>
+        <w:t>Gemini-S1：全志 R528，2.8 寸 SPI 小屏，运行 openvela / NuttX。界面由 LVGL 和官方 LCD 后端绘制；单人语音使用官方 ai_agent 会话与消息总线、媒体录音和播放能力。开发以固定官方小屏配置为基础，没有将 7 寸屏配置套用到此硬件。</w:t>
       </w:r>
     </w:p>
     <w:p>
       <w:r>
-        <w:t>官方媒体服务采集音频，应用将 16 kHz 单声道数据流式送往阿里 Paraformer。识别文本经官方 ai_agent 的会话和消息总线送入豆包拟人模型，正式回复返回界面后由阿里 Qwen Audio 3.1 TTS 合成。播放端将云端 PCM 转换为固定硬件图需要的 48 kHz 双声道。</w:t>
+        <w:t>AI Passport：ESP32-C3，运行 ESP-IDF 5.5.3，应用基于 FoloToy 官方基线和 BSP，使用 FreeRTOS 任务、LVGL、Wi-Fi、I2S 音频与 NVS。它是联动的外部配套终端，不是 openvela 设备，也不是本项目的新硬件 openvela 移植成果。两台都使用 LVGL，不代表使用同一种操作系统。</w:t>
       </w:r>
     </w:p>
     <w:p>
       <w:r>
-        <w:t>工程工作包括：核对官方小屏配置；修复媒体策略和增量 ROMFS 依赖；解决 NuttX 本地 socket 停止录音等待；修复进度提示抢占正式回复回调；处理播放 EOF；排查并修复录音空闲期间持续采集导致的音频积压。每项结论均记录对应版本和验证边界。</w:t>
+        <w:t>电脑协调服务：Python 服务负责角色轮次、话题、云端调用、双方确认和总结。两块设备通过带配对码的局域网 HTTP 连接电脑，云端调用使用 HTTPS。双机模式由电脑生成文本，Gemini 复用自己的界面和媒体播放，Passport 下载 PCM 播放；不宣称双机模式的全部模型推理均由 Gemini 的 ai_agent 调度。</w:t>
+      </w:r>
+    </w:p>
+    <w:p>
+      <w:r>
+        <w:t>本作品与 openvela 的直接结合点在 Gemini 的图形、AI Agent 和多媒体能力及其工程调试。Passport 用于展示跨系统设备协作，不计作 openvela 平台移植。</w:t>
       </w:r>
     </w:p>
     <w:p>
@@ -61,17 +76,27 @@
         <w:pStyle w:val="Heading1"/>
       </w:pPr>
       <w:r>
-        <w:t>原型差异点与应用方向</w:t>
+        <w:t>三、交互与实现</w:t>
       </w:r>
     </w:p>
     <w:p>
       <w:r>
-        <w:t>将原创角色、可解释的交互状态与真实嵌入式语音链路结合，提供无需小屏打字的短对话体验。开发过程沉淀了可复用的 Gemini 语音排障 Skill、主机回归、设备验收工具以及带源码与校验信息的冻结成果。</w:t>
+        <w:t>Gemini 的 ENTER 键或屏幕录音图标控制录音；Passport 中键短按开始录音、再次短按结束发送，长按进入双机交互。两个角色通过服务传递文本，而不是通过麦克风识别对方扬声器，减少互相回录造成的串话。</w:t>
       </w:r>
     </w:p>
     <w:p>
       <w:r>
-        <w:t>目前尚无用户规模、付费转化或商业收入数据。潜在方向是桌面陪伴和角色互动硬件；下一阶段需要用户试用、成本测算和硬件外观设计来验证价值。</w:t>
+        <w:t>双机正常流程为六次交替发言。协调服务等待两台设备确认显示及发言端播放完成，再进入下一句；结束后根据已完成的对话生成总结，由 Gemini 朗读，两屏保留。取消、断线和播放失败会结束本轮，不把失败记录当作成功对话加入总结。</w:t>
+      </w:r>
+    </w:p>
+    <w:p>
+      <w:r>
+        <w:t>Gemini 使用轻量分层角色动画和整图表情差分，具备呼吸、眨眼及按 PCM 音量驱动的嘴型，长回复可随播放近似滚动。该实现不是 Live2D/Cubism，也不是音素级口型同步。Passport 使用原创小澄角色、中文浮层、实体键翻看文字及 PCM 音量嘴型。</w:t>
+      </w:r>
+    </w:p>
+    <w:p>
+      <w:r>
+        <w:t>语音识别为阿里 paraformer-realtime-v2；文字回复为火山豆包 doubao-seed-character-260628；语音合成为阿里 qwen-audio-3.1-tts-flash。没有使用阿里文字对话模型。云端 Key 不写入公开固件，电脑和 Gemini 分别保存本地配置。</w:t>
       </w:r>
     </w:p>
     <w:p>
@@ -79,17 +104,17 @@
         <w:pStyle w:val="Heading1"/>
       </w:pPr>
       <w:r>
-        <w:t>已验证与待验证</w:t>
+        <w:t>四、工程工作与可复用成果</w:t>
       </w:r>
     </w:p>
     <w:p>
       <w:r>
-        <w:t>用户已确认小屏、基础文本对话和真实语音识别。前一版在板端完成两轮文本请求、模型回复和播放软件流程，模型耗时分别 889 ms 与 1274 ms，TTS 首块分别 585 ms 与 793 ms。这是两次样本，不能当作平均性能或端到端延迟。</w:t>
+        <w:t>针对 openvela 小屏与语音链路，工程工作覆盖官方配置核对、媒体策略、ROMFS 增量构建依赖、录音停止等待、正式回复回调、播放 EOF 及空闲音频积压排查。录音、网络和播放在工作线程执行，避免阻塞界面回调。双机扩展保留 Gemini 的显示及音频路径，通过独立局域网客户端接入。</w:t>
       </w:r>
     </w:p>
     <w:p>
       <w:r>
-        <w:t>当前 20:26:48 版本包含空闲采集修复和绮迹人设，已完成编译、主机回归与最终镜像验证。板端连续录音、实际听感、断网恢复和长时间稳定性仍待验收。本轮 ADB 已恢复，实读构建时间仍为 19:50:54，版本门禁未通过；需烧入最新候选镜像后继续。旧版 Wi-Fi 处于 RUNNING，媒体服务存活，阿里 Key 已配置，但时钟未校准。角色回复效果和物理扬声器输出也需现场确认。</w:t>
+        <w:t>交付内容包括应用源码、固定官方基线记录、准备脚本、主机协议测试、固件与资源校验工具、设备诊断工具、角色来源说明以及可复用的 Gemini 语音排障 Skill。开发中将构建、主机回归、设备软件确认和用户可见听感分开记录，不以编译成功替代实机验收。</w:t>
       </w:r>
     </w:p>
     <w:p>
@@ -97,17 +122,22 @@
         <w:pStyle w:val="Heading1"/>
       </w:pPr>
       <w:r>
-        <w:t>AI 辅助开发</w:t>
+        <w:t>五、测试证据与当前限制</w:t>
       </w:r>
     </w:p>
     <w:p>
       <w:r>
-        <w:t>AI 参与需求整理、官方源码阅读、代码修改、测试构建、设备日志分析与文档制作。典型方法是先定位链路阶段，再以真实源码和板端证据验证假设；将“构建成功”“主机测试通过”“实机软件流程完成”“物理声音可听”分开记录。</w:t>
+        <w:t>2026-09-20，一轮真实双硬件对话完成六次交替发言及最终总结，用时 109.99 秒；非脚本模式、语音开启，双方均返回完成确认，结束后保持在线，Gemini 回到空闲。用户现场反馈声音没有重叠。这是单轮结果，不是平均响应时间或长期稳定性结论。对应证据：artifacts/duet-device-20260920/live-round-fixed.json 与 video-readiness.json。协调服务相关主机回归共 22 项通过。</w:t>
       </w:r>
     </w:p>
     <w:p>
       <w:r>
-        <w:t>可复用 Skill 位于 skills/gemini-voice-diagnosis/SKILL.md。当前使用 Codex 辅助开发；已从真实原生记录兼容补采 9 个会话、1,766 个事件，通过未修改的官方格式校验。日志明确标记为部分手动补采，排除内部推理与系统指令并对凭据脱敏，是否计入比赛评分仍需组委会确认。既有其他工具的私有会话备份不公开。本说明不是原始对话日志。</w:t>
+        <w:t>随后 S1 复查发现启动后时钟未校准，已通过 ADB 校正；实际录音读到 150384 字节，约 4.7 秒 PCM，但阿里识别服务返回 Arrearage，当前识别受云端账户或额度状态阻断。界面将服务错误显示成“没有识别到语音 (0)”，错误提示仍待修正。采到 PCM 不单独证明语音清晰度。</w:t>
+      </w:r>
+    </w:p>
+    <w:p>
+      <w:r>
+        <w:t>Passport 依赖的电脑服务曾停止，日志出现无法创建新线程；服务已恢复并重新收到双机心跳，但根因与长时间稳定性仍待排查。此前成功演示不代表当前所有云端服务均可用。冷启动校时、断网恢复、长时间压力、当前版本的连续麦克风识别仍待验收。</w:t>
       </w:r>
     </w:p>
     <w:p>
@@ -115,22 +145,81 @@
         <w:pStyle w:val="Heading1"/>
       </w:pPr>
       <w:r>
-        <w:t>交付与提交状态</w:t>
+        <w:t>六、AI 辅助开发与日志</w:t>
       </w:r>
     </w:p>
     <w:p>
       <w:r>
-        <w:t>本地已具备应用源码、准备脚本、主机回归、镜像验证器、设备配置与验收工具、官方提交锁文件以及冻结固件。当前通用固件为 qiji-chat-capture-idle.img；调试网络镜像仅供本地使用。公开产物不包含 API Key 或调试网络密码。</w:t>
+        <w:t>AI 参与需求、官方源码阅读、代码修改、构建、回归、设备日志分析与材料整理。典型流程是按录音、ASR、模型、TTS 和播放阶段定位，利用版本与日志验证，而非反复更换整包。</w:t>
       </w:r>
     </w:p>
     <w:p>
       <w:r>
-        <w:t>本版以草稿 PR 预提交，尚未正式合入。还需完成：最新固件板端验收、5 分钟以内的真实演示视频、Codex 兼容日志的比赛接收确认，以及公共仓补丁的独立 PR 整理。</w:t>
+        <w:t>可复用 Skill：skills/gemini-voice-diagnosis/SKILL.md。已归集 12 个 Codex 会话的部分兼容补采，共 2532 个事件、13 个 JSONL 文件，通过未修改官方格式校验。保留早期归档并追加 766 个事件；本机压缩造成的历史缺口无法据此恢复，不是完整自动采集记录，是否计入比赛评分尚待官方确认。日志范围、脱敏与来源限制见 docs/contest/Codex兼容补采说明.md，不公开本地原始会话和凭据。</w:t>
+      </w:r>
+    </w:p>
+    <w:p>
+      <w:pPr>
+        <w:pStyle w:val="Heading1"/>
+      </w:pPr>
+      <w:r>
+        <w:t>七、原创范围与素材</w:t>
       </w:r>
     </w:p>
     <w:p>
       <w:r>
-        <w:t>规则依据：官方大赛总览（https://github.com/open-vela/docs/blob/dev-ai-contest-2026/zh-cn/contest_2026/contest_overview.md）与代码提交指南（https://github.com/open-vela/docs/blob/dev-ai-contest-2026/zh-cn/contest_2026/code_submission_guide.md）。官方文档列出的作品提交截止为 9 月 20 日，具体截止时刻以组委会通知为准。</w:t>
+        <w:t>原创贡献包括双硬件交互、角色轮次与总结协议、应用界面和工程实现，小澄为项目原创角色。Gemini 当前演示角色是《学园偶像大师》藤田琴音的非官方演绎，采用用户提供参考图生成衍生素材；不能将该角色与图片声明为项目原创或自动纳入 Apache-2.0。素材来源见 app/gemini_chat_minimal/ARTWORK.md，官方人物资料来源索引见 character/sources.json。</w:t>
+      </w:r>
+    </w:p>
+    <w:p>
+      <w:r>
+        <w:t>项目新增代码使用 Apache-2.0，第三方组件、字体和图标保留各自许可。官方规则要求作品原创、无权利纠纷；当前演示中的衍生角色素材参赛使用边界需要确认，未声明已取得角色授权。</w:t>
+      </w:r>
+    </w:p>
+    <w:p>
+      <w:pPr>
+        <w:pStyle w:val="Heading1"/>
+      </w:pPr>
+      <w:r>
+        <w:t>八、交付与后续方向</w:t>
+      </w:r>
+    </w:p>
+    <w:p>
+      <w:r>
+        <w:t>提交入口为专属仓的 README、作品介绍 DOCX、AI Coding 日志与排障 Skill、复现指南和证据索引。用户已录制演示视频，待自行上传并在视频说明文件补链接。公共仓修改的独立 PR 及日志接收范围仍须完成核对；本版源码、材料和脱敏日志通过专属仓 PR #2 提交，合并与检查状态以 GitHub 为准。</w:t>
+      </w:r>
+    </w:p>
+    <w:p>
+      <w:r>
+        <w:t>后续优先改善云端失败提示、开机校时和协调服务稳定性，再探索减少电脑依赖、持久共享记忆和外观设计。潜在应用为桌面与随身伙伴协作，目前无用户规模、付费转化、商业收入或量产成本验证。</w:t>
+      </w:r>
+    </w:p>
+    <w:p>
+      <w:pPr>
+        <w:pStyle w:val="Heading1"/>
+      </w:pPr>
+      <w:r>
+        <w:t>官方依据</w:t>
+      </w:r>
+    </w:p>
+    <w:p>
+      <w:r>
+        <w:t>大赛总览：https://github.com/open-vela/docs/blob/dev-ai-contest-2026/zh-cn/contest_2026/contest_overview.md</w:t>
+      </w:r>
+    </w:p>
+    <w:p>
+      <w:r>
+        <w:t>代码提交指南：https://github.com/open-vela/docs/blob/dev-ai-contest-2026/zh-cn/contest_2026/code_submission_guide.md</w:t>
+      </w:r>
+    </w:p>
+    <w:p>
+      <w:r>
+        <w:t>AI 日志手册：https://github.com/open-vela/docs/blob/dev-ai-contest-2026/zh-cn/contest_2026/ai_coding_log_guide.md</w:t>
+      </w:r>
+    </w:p>
+    <w:p>
+      <w:r>
+        <w:t>核对日期：2026-09-20。官方要求介绍文档、五分钟以内常见格式视频和专属仓地址；通过专属仓 PR 提交，公共仓修改单独按官方流程处理。</w:t>
       </w:r>
     </w:p>
     <w:sectPr>
@@ -152,7 +241,7 @@
       <w:jc w:val="right"/>
     </w:pPr>
     <w:r>
-      <w:t xml:space="preserve">绮迹 · 参赛介绍草稿 | </w:t>
+      <w:t xml:space="preserve">绮迹 · 双硬件伙伴介绍 | </w:t>
     </w:r>
     <w:fldSimple w:instr="PAGE"/>
   </w:p>

</xml_diff>